<commit_message>
docs(report): tighten prose so content body fits 5 pages (refs on own page)
</commit_message>
<xml_diff>
--- a/docs/CoinWise_Report.docx
+++ b/docs/CoinWise_Report.docx
@@ -22852,7 +22852,7 @@
           <w:sz w:val="26"/>
           <w:szCs w:val="26"/>
         </w:rPr>
-        <w:t>CoinWise</w:t>
+        <w:t>CoinWise AI targets Vietnam's retail crypto market, where participation is high but structured decision support is weak. Vietnam ranks fourth in the Chainalysis 2025 Global Crypto Adoption Index, and official sources report about 17–21 million domestic holders (VGP, 2026). The core problem is not access but the lack of localized education, VND-native workflows, and risk-aware guidance for users who rely on hype, influencers, and USD-first tools.</w:t>
       </w:r>
       <w:proofErr w:type="spellEnd"/>
       <w:r>
@@ -22860,7 +22860,6 @@
           <w:sz w:val="26"/>
           <w:szCs w:val="26"/>
         </w:rPr>
-        <w:t xml:space="preserve"> AI targets Vietnam's retail crypto market, where participation is </w:t>
       </w:r>
       <w:proofErr w:type="gramStart"/>
       <w:r>
@@ -22868,7 +22867,6 @@
           <w:sz w:val="26"/>
           <w:szCs w:val="26"/>
         </w:rPr>
-        <w:t>high</w:t>
       </w:r>
       <w:proofErr w:type="gramEnd"/>
       <w:r>
@@ -22876,7 +22874,6 @@
           <w:sz w:val="26"/>
           <w:szCs w:val="26"/>
         </w:rPr>
-        <w:t xml:space="preserve"> but structured decision support remains weak. Vietnam ranks fourth in the </w:t>
       </w:r>
       <w:proofErr w:type="spellStart"/>
       <w:r>
@@ -22884,7 +22881,6 @@
           <w:sz w:val="26"/>
           <w:szCs w:val="26"/>
         </w:rPr>
-        <w:t>Chainalysis</w:t>
       </w:r>
       <w:proofErr w:type="spellEnd"/>
       <w:r>
@@ -22892,7 +22888,6 @@
           <w:sz w:val="26"/>
           <w:szCs w:val="26"/>
         </w:rPr>
-        <w:t xml:space="preserve"> 2025 Global Crypto Adoption Index (</w:t>
       </w:r>
       <w:proofErr w:type="spellStart"/>
       <w:r>
@@ -22900,7 +22895,6 @@
           <w:sz w:val="26"/>
           <w:szCs w:val="26"/>
         </w:rPr>
-        <w:t>Chainalysis</w:t>
       </w:r>
       <w:proofErr w:type="spellEnd"/>
       <w:r>
@@ -22908,7 +22902,6 @@
           <w:sz w:val="26"/>
           <w:szCs w:val="26"/>
         </w:rPr>
-        <w:t>, 2025), while the Viet Nam Government Portal reports about 17 million domestic crypto-asset holders and cites Triple-A's estimate of roughly 21 million holders (VGP, 2026). The core problem is not access to crypto, but the lack of localized education, VND-native workflows, and risk-aware guidance for users who often rely on hype, influencers, and USD-first tools.</w:t>
       </w:r>
     </w:p>
     <w:p>
@@ -23035,7 +23028,7 @@
           <w:sz w:val="26"/>
           <w:szCs w:val="26"/>
         </w:rPr>
-        <w:t xml:space="preserve">The thesis is that safer crypto participation can be built through practice, feedback, and localized intelligence. As users learn, trade virtually, comment, and compete, </w:t>
+        <w:t>The thesis: safer crypto participation built through practice, feedback, and localized intelligence. As users learn, trade, comment, and compete, CoinWise accumulates a Vietnam-specific dataset of behavior, sentiment, and learning outcomes that improves recommendations and strengthens defensibility.</w:t>
       </w:r>
       <w:proofErr w:type="spellStart"/>
       <w:r>
@@ -23043,7 +23036,6 @@
           <w:sz w:val="26"/>
           <w:szCs w:val="26"/>
         </w:rPr>
-        <w:t>CoinWise</w:t>
       </w:r>
       <w:proofErr w:type="spellEnd"/>
       <w:r>
@@ -23051,7 +23043,6 @@
           <w:sz w:val="26"/>
           <w:szCs w:val="26"/>
         </w:rPr>
-        <w:t xml:space="preserve"> can accumulate a Vietnam-specific dataset of behavior, sentiment, and learning outcomes that improves recommendations and strengthens defensibility.</w:t>
       </w:r>
     </w:p>
     <w:p>
@@ -23103,7 +23094,7 @@
           <w:sz w:val="26"/>
           <w:szCs w:val="26"/>
         </w:rPr>
-        <w:t>CoinWise treats public attention and market psychology as financial signals because crypto prices are often influenced by narratives before they are visible in traditional financial data. The implemented pipeline collects crypto-native social text from StockTwits — the primary social source and the basis of the model's training corpus — with Reddit and Hacker News as fallbacks, plus Alternative.me Fear &amp; Greed data, CoinGecko community metrics, and RSS crypto news. Reddit is attempted first but is frequently rate-limited, so StockTwits carries the working social signal. Four channels — social text, news tone, CoinGecko vote share, and Fear &amp; Greed — feed the multi-source fusion.</w:t>
+        <w:t>CoinWise treats public attention and market psychology as financial signals because crypto prices often move on narratives before they appear in traditional financial data. The pipeline collects crypto-native social text from StockTwits (the primary social source and the basis of the training corpus), with Reddit and Hacker News as fallbacks, plus Alternative.me Fear &amp; Greed, CoinGecko community metrics, and RSS crypto news — the four channels (social, news, CoinGecko, Fear &amp; Greed) feeding the multi-source fusion.</w:t>
       </w:r>
       <w:proofErr w:type="spellEnd"/>
       <w:r>
@@ -23512,7 +23503,7 @@
           <w:sz w:val="26"/>
           <w:szCs w:val="26"/>
         </w:rPr>
-        <w:t>The AI pipeline follows Collect, Analyze, Fuse, and Apply. Collected text is scored by a crypto-tuned VADER-style lexicon, then classified by a Logistic Regression model trained from scratch — selected as the best of four scratch-trained classifiers (Logistic Regression, Linear SVM, Multinomial Naive Bayes, and Complement Naive Bayes) by macro-F1. Mention volume is monitored through Z-score anomaly detection (a spike is flagged when z &gt; 1.5sigma over at least five samples) to identify sudden attention spikes. Fusion runs in two stages: an inner text blend (VADER 40% + trained model 60%) scores both social and news text, and an outer blend combines social text (0.30), news tone (0.20), CoinGecko vote share (0.25), and Fear &amp; Greed (0.25) into a composite score, confidence score, label, and signal; dead channels drop to zero weight and the survivors are renormalized. Source provenance and graceful degradation are important design choices: if a source fails, the output is still produced but marked as less complete.</w:t>
+        <w:t>The AI pipeline follows Collect, Analyze, Fuse, and Apply. Text is scored by a crypto-tuned VADER-style lexicon, then classified by a Logistic Regression model trained from scratch — the best of four scratch-trained classifiers by macro-F1. Mention volume is tracked with Z-score anomaly detection. Fusion is two-stage: an inner text blend (VADER plus the trained model), then an outer blend of social text, news tone, CoinGecko vote share, and Fear &amp; Greed into a composite score, confidence, label, and signal. Provenance and graceful degradation keep a degraded output available when a source fails.</w:t>
       </w:r>
       <w:proofErr w:type="spellStart"/>
       <w:r>
@@ -23560,7 +23551,7 @@
           <w:sz w:val="26"/>
           <w:szCs w:val="26"/>
         </w:rPr>
-        <w:t>The classifier uses a gold-plus-silver training strategy. Manually reviewed gold labels (human-labeled) form the held-out test set for honest evaluation, while VADER-relabeled real StockTwits text plus a few synthetic hard cases expand training coverage. The shipped Logistic Regression model reports approximately 63.9% accuracy and 62.6% macro-F1 on the 155-sample human-labeled gold test set, trained on 3,984 samples with a vocabulary of 4,454 unigram and bigram terms. Per-class F1 is 68.2% positive, 71.4% negative, and 48.2% neutral — neutral is the hardest class because its boundary is genuinely ambiguous. These results are appropriate for decision support and education, not for autonomous price prediction.</w:t>
+        <w:t>The classifier uses a gold-plus-silver strategy: human-labeled gold forms the held-out test set, while VADER-relabeled StockTwits text plus a few synthetic hard cases expand training coverage. The shipped Logistic Regression model reaches about 63.9% accuracy and 62.6% macro-F1 on the 155-sample gold test, trained on 3,984 samples with a 4,454-term unigram/bigram vocabulary (per-class F1 68.2 / 71.4 / 48.2 for positive / negative / neutral). These results suit decision support and education, not autonomous price prediction.</w:t>
       </w:r>
     </w:p>
     <w:p>
@@ -23595,7 +23586,7 @@
           <w:sz w:val="26"/>
           <w:szCs w:val="26"/>
         </w:rPr>
-        <w:t>The alternative-data engine powers AI Advisor, Social Pulse, Alt-Data Lab, and Fraud Shield. Fraud Shield should be described precisely: it does not yet perform full scam detection through KYC, wallet tracing, device fingerprinting, or geolocation. Its backend combines behavioral rules with real alternative-data sentiment. It scores high trading velocity, unusually large order size, cash-concentration bursts, off-hours activity, bearish-sentiment buy attempts, and mention-spike FOMO risk, then returns SAFE, REVIEW, or BLOCK.</w:t>
+        <w:t>The alternative-data engine powers AI Advisor, Social Pulse, Alt-Data Lab, and Fraud Shield. Fraud Shield does not yet do full scam detection (KYC, wallet tracing, device fingerprinting); it combines behavioral rules with real alt-data sentiment, scoring high trading velocity, large order size, cash-concentration bursts, off-hours activity, bearish-sentiment buys, and mention-spike FOMO risk, then returns SAFE, REVIEW, or BLOCK.</w:t>
       </w:r>
     </w:p>
     <w:p>
@@ -23629,7 +23620,7 @@
           <w:sz w:val="26"/>
           <w:szCs w:val="26"/>
         </w:rPr>
-        <w:t>The long-term moat is the dataset that can compound around the product. Trading behavior, learning progress, Arena participation, community comments, and responses to AI recommendations can form a Vietnam-specific financial-intelligence corpus. A generic sentiment model can be copied; a localized dataset tied to user workflows, education outcomes, and risk behavior is harder to replicate.</w:t>
+        <w:t>The long-term moat is the dataset that compounds around the product: trading behavior, learning progress, Arena participation, and responses to AI recommendations form a Vietnam-specific financial-intelligence corpus. A generic sentiment model can be copied; a localized dataset tied to user workflows and risk behavior is harder to replicate.</w:t>
       </w:r>
     </w:p>
     <w:p>
@@ -23696,7 +23687,7 @@
           <w:sz w:val="26"/>
           <w:szCs w:val="26"/>
         </w:rPr>
-        <w:t>CoinWise runs a proprietary Hono and TypeScript OpenAPI server because global sandboxes (Stripe, Plaid) cannot process VND-native workflows or expose the AI alternative-data analytics in a structured contract. The server is a core deliverable, not just plumbing: it is the single source of truth that manages both USD and VND balances, converts through live FX rates (/api/v1/fx/rates and /fx/convert), processes simulated VND deposits and withdrawals (/api/v1/accounts/{id}/deposit-vnd), and — critically — exposes the Part-A AI analytics (sentiment, insight, fraud, advisor) as typed endpoints that both the frontend and the function-calling agent consume. Balances, Arena fees, and prize payouts are represented in VND while crypto market execution stays USD-denominated. The full contract is published as live Swagger UI at /docs alongside an openapi.yaml specification.</w:t>
+        <w:t>CoinWise runs a proprietary Hono and TypeScript OpenAPI server because global sandboxes (Stripe, Plaid) cannot process VND-native workflows or serve AI analytics in a structured contract. The server is a core deliverable: the single source of truth for USD and VND balances, with live FX conversion and simulated VND deposits/withdrawals, exposing the Part-A AI analytics (sentiment, insight, fraud, advisor) as typed endpoints for both the frontend and the agent. Balances, fees, and payouts appear in VND while market execution stays USD-denominated, with live Swagger UI at /docs.</w:t>
       </w:r>
       <w:proofErr w:type="spellEnd"/>
       <w:r>
@@ -24186,28 +24177,6 @@
           </w:p>
         </w:tc>
       </w:tr>
-      <w:tr>
-        <w:tc>
-          <w:tcPr>
-            <w:tcW w:type="dxa" w:w="3600"/>
-          </w:tcPr>
-          <w:p>
-            <w:r>
-              <w:t>/docs and /openapi.yaml</w:t>
-            </w:r>
-          </w:p>
-        </w:tc>
-        <w:tc>
-          <w:tcPr>
-            <w:tcW w:type="dxa" w:w="6480"/>
-          </w:tcPr>
-          <w:p>
-            <w:r>
-              <w:t>Live Swagger UI and the OpenAPI specification documenting all custom endpoints.</w:t>
-            </w:r>
-          </w:p>
-        </w:tc>
-      </w:tr>
     </w:tbl>
     <w:p>
       <w:pPr>
@@ -24342,7 +24311,7 @@
           <w:sz w:val="26"/>
           <w:szCs w:val="26"/>
         </w:rPr>
-        <w:t>A representative workflow begins when the user asks to buy 5,000,000 VND of BTC. Gemini identifies the asset, side, and amount; the backend converts the notional value; the agent retrieves market and alternative-data context; Fraud Shield evaluates behavioral and FOMO risk; and the system returns a quote with a verdict. The trade is not silently executed: the user must confirm before completion. This satisfies the agentic requirement while preserving user control.</w:t>
+        <w:t>A representative workflow: the user asks to buy 5,000,000 VND of BTC. Gemini parses asset, side, and amount; the backend converts the notional; the agent retrieves market and alt-data context; Fraud Shield evaluates behavioral and FOMO risk; and the system returns a quote with a verdict. The trade is never silent — the user confirms before completion — satisfying the agentic requirement while preserving control.</w:t>
       </w:r>
     </w:p>
     <w:p>
@@ -24459,7 +24428,7 @@
           <w:sz w:val="26"/>
           <w:szCs w:val="26"/>
         </w:rPr>
-        <w:t>CoinWise</w:t>
+        <w:t>CoinWise is incubation-ready: a clear market wedge plus a working MVP. The wedge is education-led crypto practice for Vietnamese retail users — strong for acquisition, safer than real-money brokerage. The MVP already shows the core venture assets: alternative-data intelligence, agentic AI, localized infrastructure, and a scaling roadmap.</w:t>
       </w:r>
       <w:proofErr w:type="spellEnd"/>
       <w:r>
@@ -24467,7 +24436,6 @@
           <w:sz w:val="26"/>
           <w:szCs w:val="26"/>
         </w:rPr>
-        <w:t xml:space="preserve"> is incubation-ready because it pairs a clear market wedge with a working MVP. The wedge is education-led crypto practice for Vietnamese retail users: attractive enough for user acquisition, but safer than launching directly into real-money brokerage. The MVP already demonstrates the core venture assets needed for early validation: alternative-data intelligence, agentic AI, localized infrastructure, and a scaling roadmap.</w:t>
       </w:r>
     </w:p>
     <w:p>
@@ -24502,7 +24470,7 @@
           <w:sz w:val="26"/>
           <w:szCs w:val="26"/>
         </w:rPr>
-        <w:t xml:space="preserve">The near-term revenue model should focus on Pro and Elite subscriptions, premium AI Advisor features, advanced sentiment analytics, Academy purchases, and Arena participation economics. As the dataset matures, </w:t>
+        <w:t>Near-term revenue: Pro and Elite subscriptions, premium AI Advisor features, advanced sentiment analytics, Academy purchases, and Arena economics. As the dataset matures, CoinWise can expand into B2B sentiment and risk-monitoring APIs for fintech operators, exchanges, or education partners.</w:t>
       </w:r>
       <w:proofErr w:type="spellStart"/>
       <w:r>
@@ -24510,7 +24478,6 @@
           <w:sz w:val="26"/>
           <w:szCs w:val="26"/>
         </w:rPr>
-        <w:t>CoinWise</w:t>
       </w:r>
       <w:proofErr w:type="spellEnd"/>
       <w:r>
@@ -24518,7 +24485,6 @@
           <w:sz w:val="26"/>
           <w:szCs w:val="26"/>
         </w:rPr>
-        <w:t xml:space="preserve"> can expand into B2B sentiment and risk-monitoring APIs for fintech operators, exchanges, or education partners.</w:t>
       </w:r>
     </w:p>
     <w:p>
@@ -24933,7 +24899,7 @@
           <w:sz w:val="26"/>
           <w:szCs w:val="26"/>
         </w:rPr>
-        <w:t>The main risks are regulation, data-source reliability, model limitations, and infrastructure persistence. Mitigation is built into the plan: start with education and paper trading, use provenance and graceful degradation, continuously retrain on reviewed labels, and migrate demo-grade state to Redis, PostgreSQL, or another persistent production store.</w:t>
+        <w:t>Main risks: regulation, data-source reliability, model limitations, and infrastructure persistence. Mitigation is built in: start with education and paper trading, use provenance and graceful degradation, retrain on reviewed labels, and migrate demo-grade state to a persistent production store (Redis/PostgreSQL).</w:t>
       </w:r>
     </w:p>
     <w:p>
@@ -24968,7 +24934,7 @@
           <w:sz w:val="26"/>
           <w:szCs w:val="26"/>
         </w:rPr>
-        <w:t>CoinWise</w:t>
+        <w:t>CoinWise seeks incubator support for compliance mentorship, banking/payment partner access, ML dataset expansion, and go-to-market validation. It is strongest as an investable Vietnam-first fintech venture: alternative data creates the intelligence layer, agentic AI turns insight into guided actions, and the OpenAPI backend enables localization.</w:t>
       </w:r>
       <w:proofErr w:type="spellEnd"/>
       <w:r>
@@ -24976,7 +24942,6 @@
           <w:sz w:val="26"/>
           <w:szCs w:val="26"/>
         </w:rPr>
-        <w:t xml:space="preserve"> seeks incubator support for compliance mentorship, banking and payment partner access, ML dataset expansion, and go-to-market validation. The project is strongest when presented as an investable Vietnam-first fintech venture: alternative data creates the intelligence layer, agentic AI turns insight into guided actions, the </w:t>
       </w:r>
       <w:proofErr w:type="spellStart"/>
       <w:r>
@@ -24984,7 +24949,6 @@
           <w:sz w:val="26"/>
           <w:szCs w:val="26"/>
         </w:rPr>
-        <w:t>OpenAPI</w:t>
       </w:r>
       <w:proofErr w:type="spellEnd"/>
       <w:r>
@@ -24992,7 +24956,6 @@
           <w:sz w:val="26"/>
           <w:szCs w:val="26"/>
         </w:rPr>
-        <w:t xml:space="preserve"> backend enables localization, and the business plan turns the prototype into a scalable platform.</w:t>
       </w:r>
     </w:p>
     <w:p>

</xml_diff>